<commit_message>
papers(orion-13): close specification review blockers
</commit_message>
<xml_diff>
--- a/papers/orion-13-global-knowledge-portrait/submission/publication-final-20260901/journal/manuscript.docx
+++ b/papers/orion-13-global-knowledge-portrait/submission/publication-final-20260901/journal/manuscript.docx
@@ -287,19 +287,19 @@
         <w:t xml:space="preserve"> </w:t>
       </w:r>
       <w:r>
-        <w:t xml:space="preserve">These panels support a bounded observation: retaining</w:t>
-      </w:r>
-      <w:r>
-        <w:t xml:space="preserve"> </w:t>
-      </w:r>
-      <w:r>
-        <w:t xml:space="preserve">polarity and an explicit non-merge terminal avoids the six false agreements</w:t>
-      </w:r>
-      <w:r>
-        <w:t xml:space="preserve"> </w:t>
-      </w:r>
-      <w:r>
-        <w:t xml:space="preserve">created by the registered flat rule. They do not establish population error</w:t>
+        <w:t xml:space="preserve">These panels support a bounded observation: the complete</w:t>
+      </w:r>
+      <w:r>
+        <w:t xml:space="preserve"> </w:t>
+      </w:r>
+      <w:r>
+        <w:t xml:space="preserve">polarity-sensitive non-merge condition avoids the six false agreements created</w:t>
+      </w:r>
+      <w:r>
+        <w:t xml:space="preserve"> </w:t>
+      </w:r>
+      <w:r>
+        <w:t xml:space="preserve">by the registered flat rule. They do not establish population error</w:t>
       </w:r>
       <w:r>
         <w:t xml:space="preserve"> </w:t>
@@ -554,8 +554,46 @@
         <w:t xml:space="preserve">432 scored rows are not independent scientific observations.</w:t>
       </w:r>
     </w:p>
+    <w:p>
+      <w:pPr>
+        <w:pStyle w:val="BodyText"/>
+      </w:pPr>
+      <w:r>
+        <w:t xml:space="preserve">The individual coordinates, inconsistency-sensitive separation, provenance and</w:t>
+      </w:r>
+      <w:r>
+        <w:t xml:space="preserve"> </w:t>
+      </w:r>
+      <w:r>
+        <w:t xml:space="preserve">abstention are inherited from the neighbouring traditions cited above. The</w:t>
+      </w:r>
+      <w:r>
+        <w:t xml:space="preserve"> </w:t>
+      </w:r>
+      <w:r>
+        <w:t xml:space="preserve">increment tested here is their frozen, claim-relative composition into one</w:t>
+      </w:r>
+      <w:r>
+        <w:t xml:space="preserve"> </w:t>
+      </w:r>
+      <w:r>
+        <w:t xml:space="preserve">decision condition, its prospective fixed-panel evaluation and its executable</w:t>
+      </w:r>
+      <w:r>
+        <w:t xml:space="preserve"> </w:t>
+      </w:r>
+      <w:r>
+        <w:t xml:space="preserve">contract. We do not claim a new general ontology language or a new extraction</w:t>
+      </w:r>
+      <w:r>
+        <w:t xml:space="preserve"> </w:t>
+      </w:r>
+      <w:r>
+        <w:t xml:space="preserve">method.</w:t>
+      </w:r>
+    </w:p>
     <w:bookmarkEnd w:id="9"/>
-    <w:bookmarkStart w:id="14" w:name="methods"/>
+    <w:bookmarkStart w:id="15" w:name="methods"/>
     <w:p>
       <w:pPr>
         <w:pStyle w:val="Heading1"/>
@@ -564,7 +602,7 @@
         <w:t xml:space="preserve">Methods</w:t>
       </w:r>
     </w:p>
-    <w:bookmarkStart w:id="10" w:name="mapping-decisions"/>
+    <w:bookmarkStart w:id="11" w:name="mapping-decisions"/>
     <w:p>
       <w:pPr>
         <w:pStyle w:val="Heading2"/>
@@ -816,29 +854,440 @@
         <w:t xml:space="preserve"> </w:t>
       </w:r>
       <w:r>
-        <w:t xml:space="preserve">information. The evaluated rule returns one of three scientific decisions:</w:t>
-      </w:r>
-      <w:r>
-        <w:t xml:space="preserve"> </w:t>
-      </w:r>
-      <w:r>
-        <w:t xml:space="preserve">admissible merge, typed non-merge, or undetermined. A required incompatibility</w:t>
-      </w:r>
-      <w:r>
-        <w:t xml:space="preserve"> </w:t>
-      </w:r>
-      <w:r>
-        <w:t xml:space="preserve">produces non-merge; a missing load-bearing coordinate produces undetermined.</w:t>
-      </w:r>
-      <w:r>
-        <w:t xml:space="preserve"> </w:t>
-      </w:r>
-      <w:r>
-        <w:t xml:space="preserve">The study does not infer absent coordinates from source text.</w:t>
-      </w:r>
-    </w:p>
+        <w:t xml:space="preserve">information. Table </w:t>
+      </w:r>
+      <w:hyperlink w:anchor="tab:decision-rule">
+        <w:r>
+          <w:rPr>
+            <w:rStyle w:val="Hyperlink"/>
+          </w:rPr>
+          <w:t xml:space="preserve">1</w:t>
+        </w:r>
+      </w:hyperlink>
+      <w:r>
+        <w:t xml:space="preserve"> </w:t>
+      </w:r>
+      <w:r>
+        <w:t xml:space="preserve">gives the frozen precedence rule.</w:t>
+      </w:r>
+      <w:r>
+        <w:t xml:space="preserve"> </w:t>
+      </w:r>
+      <w:r>
+        <w:t xml:space="preserve">Each condition is evaluated from top to bottom and the first applicable row is</w:t>
+      </w:r>
+      <w:r>
+        <w:t xml:space="preserve"> </w:t>
+      </w:r>
+      <w:r>
+        <w:t xml:space="preserve">returned. Equality means exact equality of the exposed identifiers or enum</w:t>
+      </w:r>
+      <w:r>
+        <w:t xml:space="preserve"> </w:t>
+      </w:r>
+      <w:r>
+        <w:t xml:space="preserve">value. An empty coordinate is not declared incompatible; absence produces an</w:t>
+      </w:r>
+      <w:r>
+        <w:t xml:space="preserve"> </w:t>
+      </w:r>
+      <w:r>
+        <w:t xml:space="preserve">undetermined decision only when it is recorded as an unresolved ambiguity or</w:t>
+      </w:r>
+      <w:r>
+        <w:t xml:space="preserve"> </w:t>
+      </w:r>
+      <w:r>
+        <w:t xml:space="preserve">prevents predicate normalization. The study does not infer absent coordinates</w:t>
+      </w:r>
+      <w:r>
+        <w:t xml:space="preserve"> </w:t>
+      </w:r>
+      <w:r>
+        <w:t xml:space="preserve">from source text.</w:t>
+      </w:r>
+    </w:p>
+    <w:bookmarkStart w:id="10" w:name="tab:decision-rule"/>
+    <w:p>
+      <w:pPr>
+        <w:pStyle w:val="TableCaption"/>
+      </w:pPr>
+      <w:r>
+        <w:t xml:space="preserve">Normative holdout decision rule. For example, aligned asserted</w:t>
+      </w:r>
+      <w:r>
+        <w:t xml:space="preserve"> </w:t>
+      </w:r>
+      <w:r>
+        <w:t xml:space="preserve">projections with opposite polarity return contradiction and hence typed</w:t>
+      </w:r>
+      <w:r>
+        <w:t xml:space="preserve"> </w:t>
+      </w:r>
+      <w:r>
+        <w:t xml:space="preserve">non-merge; an explicit unresolved ambiguity returns undetermined.</w:t>
+      </w:r>
+    </w:p>
+    <w:tbl>
+      <w:tblPr>
+        <w:tblStyle w:val="Table"/>
+        <w:tblW w:type="pct" w:w="4650"/>
+        <w:tblLayout w:type="fixed"/>
+        <w:tblLook w:firstRow="1" w:lastRow="0" w:firstColumn="0" w:lastColumn="0" w:noHBand="0" w:noVBand="0" w:val="0020"/>
+        <w:tblCaption w:val="Normative holdout decision rule. For example, aligned asserted projections with opposite polarity return contradiction and hence typed non-merge; an explicit unresolved ambiguity returns undetermined."/>
+      </w:tblPr>
+      <w:tblGrid>
+        <w:gridCol w:w="4593"/>
+        <w:gridCol w:w="1504"/>
+        <w:gridCol w:w="1267"/>
+      </w:tblGrid>
+      <w:tr>
+        <w:trPr>
+          <w:tblHeader w:val="on"/>
+        </w:trPr>
+        <w:tc>
+          <w:tcPr/>
+          <w:p>
+            <w:pPr>
+              <w:pStyle w:val="Compact"/>
+              <w:jc w:val="left"/>
+            </w:pPr>
+            <w:r>
+              <w:rPr>
+                <w:b/>
+                <w:bCs/>
+              </w:rPr>
+              <w:t xml:space="preserve">First applicable condition</w:t>
+            </w:r>
+          </w:p>
+        </w:tc>
+        <w:tc>
+          <w:tcPr/>
+          <w:p>
+            <w:pPr>
+              <w:pStyle w:val="Compact"/>
+              <w:jc w:val="left"/>
+            </w:pPr>
+            <w:r>
+              <w:rPr>
+                <w:b/>
+                <w:bCs/>
+              </w:rPr>
+              <w:t xml:space="preserve">Fine relation</w:t>
+            </w:r>
+          </w:p>
+        </w:tc>
+        <w:tc>
+          <w:tcPr/>
+          <w:p>
+            <w:pPr>
+              <w:pStyle w:val="Compact"/>
+              <w:jc w:val="left"/>
+            </w:pPr>
+            <w:r>
+              <w:rPr>
+                <w:b/>
+                <w:bCs/>
+              </w:rPr>
+              <w:t xml:space="preserve">Decision</w:t>
+            </w:r>
+          </w:p>
+        </w:tc>
+      </w:tr>
+      <w:tr>
+        <w:tc>
+          <w:tcPr/>
+          <w:p>
+            <w:pPr>
+              <w:pStyle w:val="Compact"/>
+              <w:jc w:val="left"/>
+            </w:pPr>
+            <w:r>
+              <w:t xml:space="preserve">Either record retains an unresolved ambiguity, or predicates are not normalized</w:t>
+            </w:r>
+            <w:r>
+              <w:t xml:space="preserve"> </w:t>
+            </w:r>
+            <w:r>
+              <w:t xml:space="preserve">to the same relation</w:t>
+            </w:r>
+          </w:p>
+        </w:tc>
+        <w:tc>
+          <w:tcPr/>
+          <w:p>
+            <w:pPr>
+              <w:pStyle w:val="Compact"/>
+              <w:jc w:val="left"/>
+            </w:pPr>
+            <w:r>
+              <w:t xml:space="preserve">unresolved</w:t>
+            </w:r>
+          </w:p>
+        </w:tc>
+        <w:tc>
+          <w:tcPr/>
+          <w:p>
+            <w:pPr>
+              <w:pStyle w:val="Compact"/>
+              <w:jc w:val="left"/>
+            </w:pPr>
+            <w:r>
+              <w:t xml:space="preserve">undetermined</w:t>
+            </w:r>
+          </w:p>
+        </w:tc>
+      </w:tr>
+      <w:tr>
+        <w:tc>
+          <w:tcPr/>
+          <w:p>
+            <w:pPr>
+              <w:pStyle w:val="Compact"/>
+              <w:jc w:val="left"/>
+            </w:pPr>
+            <w:r>
+              <w:t xml:space="preserve">Both nonempty referent identifiers differ</w:t>
+            </w:r>
+          </w:p>
+        </w:tc>
+        <w:tc>
+          <w:tcPr/>
+          <w:p>
+            <w:pPr>
+              <w:pStyle w:val="Compact"/>
+              <w:jc w:val="left"/>
+            </w:pPr>
+            <w:r>
+              <w:t xml:space="preserve">distinct referent</w:t>
+            </w:r>
+          </w:p>
+        </w:tc>
+        <w:tc>
+          <w:tcPr/>
+          <w:p>
+            <w:pPr>
+              <w:pStyle w:val="Compact"/>
+              <w:jc w:val="left"/>
+            </w:pPr>
+            <w:r>
+              <w:t xml:space="preserve">typed non-merge</w:t>
+            </w:r>
+          </w:p>
+        </w:tc>
+      </w:tr>
+      <w:tr>
+        <w:tc>
+          <w:tcPr/>
+          <w:p>
+            <w:pPr>
+              <w:pStyle w:val="Compact"/>
+              <w:jc w:val="left"/>
+            </w:pPr>
+            <w:r>
+              <w:t xml:space="preserve">Both nonempty construct identifiers differ</w:t>
+            </w:r>
+          </w:p>
+        </w:tc>
+        <w:tc>
+          <w:tcPr/>
+          <w:p>
+            <w:pPr>
+              <w:pStyle w:val="Compact"/>
+              <w:jc w:val="left"/>
+            </w:pPr>
+            <w:r>
+              <w:t xml:space="preserve">distinct construct</w:t>
+            </w:r>
+          </w:p>
+        </w:tc>
+        <w:tc>
+          <w:tcPr/>
+          <w:p>
+            <w:pPr>
+              <w:pStyle w:val="Compact"/>
+              <w:jc w:val="left"/>
+            </w:pPr>
+            <w:r>
+              <w:t xml:space="preserve">typed non-merge</w:t>
+            </w:r>
+          </w:p>
+        </w:tc>
+      </w:tr>
+      <w:tr>
+        <w:tc>
+          <w:tcPr/>
+          <w:p>
+            <w:pPr>
+              <w:pStyle w:val="Compact"/>
+              <w:jc w:val="left"/>
+            </w:pPr>
+            <w:r>
+              <w:t xml:space="preserve">Both nonempty measurement identifiers differ</w:t>
+            </w:r>
+          </w:p>
+        </w:tc>
+        <w:tc>
+          <w:tcPr/>
+          <w:p>
+            <w:pPr>
+              <w:pStyle w:val="Compact"/>
+              <w:jc w:val="left"/>
+            </w:pPr>
+            <w:r>
+              <w:t xml:space="preserve">distinct measurement</w:t>
+            </w:r>
+          </w:p>
+        </w:tc>
+        <w:tc>
+          <w:tcPr/>
+          <w:p>
+            <w:pPr>
+              <w:pStyle w:val="Compact"/>
+              <w:jc w:val="left"/>
+            </w:pPr>
+            <w:r>
+              <w:t xml:space="preserve">typed non-merge</w:t>
+            </w:r>
+          </w:p>
+        </w:tc>
+      </w:tr>
+      <w:tr>
+        <w:tc>
+          <w:tcPr/>
+          <w:p>
+            <w:pPr>
+              <w:pStyle w:val="Compact"/>
+              <w:jc w:val="left"/>
+            </w:pPr>
+            <w:r>
+              <w:t xml:space="preserve">Both nonempty temporal, attribution, discourse or assumption coordinates differ,</w:t>
+            </w:r>
+            <w:r>
+              <w:t xml:space="preserve"> </w:t>
+            </w:r>
+            <w:r>
+              <w:t xml:space="preserve">or modalities differ</w:t>
+            </w:r>
+          </w:p>
+        </w:tc>
+        <w:tc>
+          <w:tcPr/>
+          <w:p>
+            <w:pPr>
+              <w:pStyle w:val="Compact"/>
+              <w:jc w:val="left"/>
+            </w:pPr>
+            <w:r>
+              <w:t xml:space="preserve">contextual difference</w:t>
+            </w:r>
+          </w:p>
+        </w:tc>
+        <w:tc>
+          <w:tcPr/>
+          <w:p>
+            <w:pPr>
+              <w:pStyle w:val="Compact"/>
+              <w:jc w:val="left"/>
+            </w:pPr>
+            <w:r>
+              <w:t xml:space="preserve">typed non-merge</w:t>
+            </w:r>
+          </w:p>
+        </w:tc>
+      </w:tr>
+      <w:tr>
+        <w:tc>
+          <w:tcPr/>
+          <w:p>
+            <w:pPr>
+              <w:pStyle w:val="Compact"/>
+              <w:jc w:val="left"/>
+            </w:pPr>
+            <w:r>
+              <w:t xml:space="preserve">Known polarities differ; the fine relation is contradiction when both modalities</w:t>
+            </w:r>
+            <w:r>
+              <w:t xml:space="preserve"> </w:t>
+            </w:r>
+            <w:r>
+              <w:t xml:space="preserve">are asserted and contextual difference otherwise</w:t>
+            </w:r>
+          </w:p>
+        </w:tc>
+        <w:tc>
+          <w:tcPr/>
+          <w:p>
+            <w:pPr>
+              <w:pStyle w:val="Compact"/>
+              <w:jc w:val="left"/>
+            </w:pPr>
+            <w:r>
+              <w:t xml:space="preserve">contradiction or contextual</w:t>
+            </w:r>
+            <w:r>
+              <w:t xml:space="preserve"> </w:t>
+            </w:r>
+            <w:r>
+              <w:t xml:space="preserve">difference</w:t>
+            </w:r>
+          </w:p>
+        </w:tc>
+        <w:tc>
+          <w:tcPr/>
+          <w:p>
+            <w:pPr>
+              <w:pStyle w:val="Compact"/>
+              <w:jc w:val="left"/>
+            </w:pPr>
+            <w:r>
+              <w:t xml:space="preserve">typed non-merge</w:t>
+            </w:r>
+          </w:p>
+        </w:tc>
+      </w:tr>
+      <w:tr>
+        <w:tc>
+          <w:tcPr/>
+          <w:p>
+            <w:pPr>
+              <w:pStyle w:val="Compact"/>
+              <w:jc w:val="left"/>
+            </w:pPr>
+            <w:r>
+              <w:t xml:space="preserve">None of the preceding conditions applies</w:t>
+            </w:r>
+          </w:p>
+        </w:tc>
+        <w:tc>
+          <w:tcPr/>
+          <w:p>
+            <w:pPr>
+              <w:pStyle w:val="Compact"/>
+              <w:jc w:val="left"/>
+            </w:pPr>
+            <w:r>
+              <w:t xml:space="preserve">compatible</w:t>
+            </w:r>
+          </w:p>
+        </w:tc>
+        <w:tc>
+          <w:tcPr/>
+          <w:p>
+            <w:pPr>
+              <w:pStyle w:val="Compact"/>
+              <w:jc w:val="left"/>
+            </w:pPr>
+            <w:r>
+              <w:t xml:space="preserve">admissible merge</w:t>
+            </w:r>
+          </w:p>
+        </w:tc>
+      </w:tr>
+    </w:tbl>
     <w:bookmarkEnd w:id="10"/>
-    <w:bookmarkStart w:id="11" w:name="fixed-panels-and-scientific-units"/>
+    <w:bookmarkEnd w:id="11"/>
+    <w:bookmarkStart w:id="12" w:name="fixed-panels-and-scientific-units"/>
     <w:p>
       <w:pPr>
         <w:pStyle w:val="Heading2"/>
@@ -953,8 +1402,8 @@
         <w:t xml:space="preserve">same-programme gold into independent adjudication.</w:t>
       </w:r>
     </w:p>
-    <w:bookmarkEnd w:id="11"/>
-    <w:bookmarkStart w:id="12" w:name="comparators-and-analysis"/>
+    <w:bookmarkEnd w:id="12"/>
+    <w:bookmarkStart w:id="13" w:name="comparators-and-analysis"/>
     <w:p>
       <w:pPr>
         <w:pStyle w:val="Heading2"/>
@@ -1005,6 +1454,68 @@
       </w:r>
       <w:r>
         <w:t xml:space="preserve">ontology-matching or integration systems.</w:t>
+      </w:r>
+    </w:p>
+    <w:p>
+      <w:pPr>
+        <w:pStyle w:val="BodyText"/>
+      </w:pPr>
+      <w:r>
+        <w:t xml:space="preserve">All rates use the 32 cases as denominator. A false merge is a compatible</w:t>
+      </w:r>
+      <w:r>
+        <w:t xml:space="preserve"> </w:t>
+      </w:r>
+      <w:r>
+        <w:t xml:space="preserve">prediction when gold is any typed non-merge relation; a false split is a typed</w:t>
+      </w:r>
+      <w:r>
+        <w:t xml:space="preserve"> </w:t>
+      </w:r>
+      <w:r>
+        <w:t xml:space="preserve">non-merge prediction when gold is compatible. An unresolved prediction counts</w:t>
+      </w:r>
+      <w:r>
+        <w:t xml:space="preserve"> </w:t>
+      </w:r>
+      <w:r>
+        <w:t xml:space="preserve">as abstention, not as either error. Thus abstaining on a gold non-merge case can</w:t>
+      </w:r>
+      <w:r>
+        <w:t xml:space="preserve"> </w:t>
+      </w:r>
+      <w:r>
+        <w:t xml:space="preserve">lower exact-match accuracy without creating a false split. The flat comparator</w:t>
+      </w:r>
+      <w:r>
+        <w:t xml:space="preserve"> </w:t>
+      </w:r>
+      <w:r>
+        <w:t xml:space="preserve">returns compatible for equal predicates and unresolved otherwise. The</w:t>
+      </w:r>
+      <w:r>
+        <w:t xml:space="preserve"> </w:t>
+      </w:r>
+      <w:r>
+        <w:t xml:space="preserve">conservative comparator returns compatible only when every exposed coordinate</w:t>
+      </w:r>
+      <w:r>
+        <w:t xml:space="preserve"> </w:t>
+      </w:r>
+      <w:r>
+        <w:t xml:space="preserve">is exactly equal and unresolved otherwise. Registered ablations remove only</w:t>
+      </w:r>
+      <w:r>
+        <w:t xml:space="preserve"> </w:t>
+      </w:r>
+      <w:r>
+        <w:t xml:space="preserve">the named coordinate comparison from the ordered rule above; the</w:t>
+      </w:r>
+      <w:r>
+        <w:t xml:space="preserve"> </w:t>
+      </w:r>
+      <w:r>
+        <w:t xml:space="preserve">force-compatibility ablation maps every typed non-merge relation to compatible.</w:t>
       </w:r>
     </w:p>
     <w:p>
@@ -1108,8 +1619,8 @@
         <w:t xml:space="preserve">development and confirmatory panels are not pooled.</w:t>
       </w:r>
     </w:p>
-    <w:bookmarkEnd w:id="12"/>
-    <w:bookmarkStart w:id="13" w:name="deterministic-contract-conformance"/>
+    <w:bookmarkEnd w:id="13"/>
+    <w:bookmarkStart w:id="14" w:name="deterministic-contract-conformance"/>
     <w:p>
       <w:pPr>
         <w:pStyle w:val="Heading2"/>
@@ -1228,9 +1739,59 @@
         <w:t xml:space="preserve">rule and must tie it exactly.</w:t>
       </w:r>
     </w:p>
-    <w:bookmarkEnd w:id="13"/>
+    <w:p>
+      <w:pPr>
+        <w:pStyle w:val="BodyText"/>
+      </w:pPr>
+      <w:r>
+        <w:t xml:space="preserve">This four-way contract refines, rather than duplicates, the holdout alphabet:</w:t>
+      </w:r>
+      <w:r>
+        <w:t xml:space="preserve"> </w:t>
+      </w:r>
+      <w:r>
+        <w:t xml:space="preserve">merge maps to admissible merge; obstruction and plural view both map to typed</w:t>
+      </w:r>
+      <w:r>
+        <w:t xml:space="preserve"> </w:t>
+      </w:r>
+      <w:r>
+        <w:t xml:space="preserve">non-merge, with plural view retaining both source projections; and unresolved</w:t>
+      </w:r>
+      <w:r>
+        <w:t xml:space="preserve"> </w:t>
+      </w:r>
+      <w:r>
+        <w:t xml:space="preserve">maps to undetermined. The mapping is therefore many-to-one. The eight</w:t>
+      </w:r>
+      <w:r>
+        <w:t xml:space="preserve"> </w:t>
+      </w:r>
+      <w:r>
+        <w:t xml:space="preserve">archetypes contain one merge, four obstruction, two plural-view and one</w:t>
+      </w:r>
+      <w:r>
+        <w:t xml:space="preserve"> </w:t>
+      </w:r>
+      <w:r>
+        <w:t xml:space="preserve">unresolved state, each repeated across labels and identifiers. The reported</w:t>
+      </w:r>
+      <w:r>
+        <w:t xml:space="preserve"> </w:t>
+      </w:r>
+      <w:r>
+        <w:t xml:space="preserve">conformance scores are exact four-way scores computed before this crosswalk;</w:t>
+      </w:r>
+      <w:r>
+        <w:t xml:space="preserve"> </w:t>
+      </w:r>
+      <w:r>
+        <w:t xml:space="preserve">they are not a second evaluation of the holdout’s fine-grained relation labels.</w:t>
+      </w:r>
+    </w:p>
     <w:bookmarkEnd w:id="14"/>
-    <w:bookmarkStart w:id="16" w:name="results"/>
+    <w:bookmarkEnd w:id="15"/>
+    <w:bookmarkStart w:id="17" w:name="results"/>
     <w:p>
       <w:pPr>
         <w:pStyle w:val="Heading1"/>
@@ -1259,7 +1820,7 @@
         <w:t xml:space="preserve">motivated the frozen holdout and is not pooled into its verdict.</w:t>
       </w:r>
     </w:p>
-    <w:bookmarkStart w:id="15" w:name="tab:results"/>
+    <w:bookmarkStart w:id="16" w:name="tab:results"/>
     <w:p>
       <w:pPr>
         <w:pStyle w:val="TableCaption"/>
@@ -1662,7 +2223,7 @@
         </w:tc>
       </w:tr>
     </w:tbl>
-    <w:bookmarkEnd w:id="15"/>
+    <w:bookmarkEnd w:id="16"/>
     <w:p>
       <w:pPr>
         <w:pStyle w:val="BodyText"/>
@@ -1755,7 +2316,7 @@
         <w:t xml:space="preserve"> </w:t>
       </w:r>
       <w:r>
-        <w:t xml:space="preserve">50/400. The complete-minus-structured difference was</w:t>
+        <w:t xml:space="preserve">50/400. The complete-minus-strong-semantic-product difference was</w:t>
       </w:r>
       <w:r>
         <w:t xml:space="preserve"> </w:t>
@@ -1846,8 +2407,8 @@
         <w:t xml:space="preserve">to the registered interfaces but do not measure population performance.</w:t>
       </w:r>
     </w:p>
-    <w:bookmarkEnd w:id="16"/>
-    <w:bookmarkStart w:id="17" w:name="discussion"/>
+    <w:bookmarkEnd w:id="17"/>
+    <w:bookmarkStart w:id="18" w:name="discussion"/>
     <w:p>
       <w:pPr>
         <w:pStyle w:val="Heading1"/>
@@ -1861,19 +2422,19 @@
         <w:pStyle w:val="FirstParagraph"/>
       </w:pPr>
       <w:r>
-        <w:t xml:space="preserve">The confirmatory observation is narrow but falsifiable. Keeping polarity and a</w:t>
-      </w:r>
-      <w:r>
-        <w:t xml:space="preserve"> </w:t>
-      </w:r>
-      <w:r>
-        <w:t xml:space="preserve">typed non-merge outcome prevented six false agreements produced when the</w:t>
-      </w:r>
-      <w:r>
-        <w:t xml:space="preserve"> </w:t>
-      </w:r>
-      <w:r>
-        <w:t xml:space="preserve">registered flat rule discarded that condition, while the predeclared</w:t>
+        <w:t xml:space="preserve">The confirmatory observation is narrow but falsifiable. The complete</w:t>
+      </w:r>
+      <w:r>
+        <w:t xml:space="preserve"> </w:t>
+      </w:r>
+      <w:r>
+        <w:t xml:space="preserve">polarity-sensitive non-merge condition prevented six false agreements produced</w:t>
+      </w:r>
+      <w:r>
+        <w:t xml:space="preserve"> </w:t>
+      </w:r>
+      <w:r>
+        <w:t xml:space="preserve">when the registered flat rule discarded that condition, while the predeclared</w:t>
       </w:r>
       <w:r>
         <w:t xml:space="preserve"> </w:t>
@@ -1885,19 +2446,19 @@
         <w:t xml:space="preserve"> </w:t>
       </w:r>
       <w:r>
-        <w:t xml:space="preserve">a negative decision. The conformance battery confirms that the deterministic</w:t>
-      </w:r>
-      <w:r>
-        <w:t xml:space="preserve"> </w:t>
-      </w:r>
-      <w:r>
-        <w:t xml:space="preserve">relation is implemented exactly and that an information-equivalent typed</w:t>
-      </w:r>
-      <w:r>
-        <w:t xml:space="preserve"> </w:t>
-      </w:r>
-      <w:r>
-        <w:t xml:space="preserve">implementation reproduces it.</w:t>
+        <w:t xml:space="preserve">a negative decision. The separate conformance battery confirms its own</w:t>
+      </w:r>
+      <w:r>
+        <w:t xml:space="preserve"> </w:t>
+      </w:r>
+      <w:r>
+        <w:t xml:space="preserve">four-way contract exactly and an information-equivalent typed implementation</w:t>
+      </w:r>
+      <w:r>
+        <w:t xml:space="preserve"> </w:t>
+      </w:r>
+      <w:r>
+        <w:t xml:space="preserve">reproduces that contract.</w:t>
       </w:r>
     </w:p>
     <w:p>
@@ -2012,8 +2573,8 @@
         <w:t xml:space="preserve">Report and are not represented as completed evidence.</w:t>
       </w:r>
     </w:p>
-    <w:bookmarkEnd w:id="17"/>
-    <w:bookmarkStart w:id="19" w:name="data-and-software-availability"/>
+    <w:bookmarkEnd w:id="18"/>
+    <w:bookmarkStart w:id="20" w:name="data-and-software-availability"/>
     <w:p>
       <w:pPr>
         <w:pStyle w:val="Heading1"/>
@@ -2056,12 +2617,12 @@
       <w:r>
         <w:t xml:space="preserve"> </w:t>
       </w:r>
-      <w:hyperlink r:id="rId18">
+      <w:hyperlink r:id="rId19">
         <w:r>
           <w:rPr>
             <w:rStyle w:val="Hyperlink"/>
           </w:rPr>
-          <w:t xml:space="preserve">https://github.com/SzeChunYiu/ORION/tree/3813e64955f03926b0276e50c21b9a65154ad3db/papers/orion-13-global-knowledge-portrait</w:t>
+          <w:t xml:space="preserve">https://github.com/SzeChunYiu/ORION/tree/3813e64955f03926b0276e50c21b9a65154ad3db</w:t>
         </w:r>
       </w:hyperlink>
       <w:r>
@@ -2071,13 +2632,61 @@
         <w:t xml:space="preserve"> </w:t>
       </w:r>
       <w:r>
-        <w:t xml:space="preserve">That snapshot contains the confirmatory records, contract generator, frozen</w:t>
-      </w:r>
-      <w:r>
-        <w:t xml:space="preserve"> </w:t>
-      </w:r>
-      <w:r>
-        <w:t xml:space="preserve">protocol, results and independent verification. Code is licensed under</w:t>
+        <w:t xml:space="preserve">Within that snapshot, the holdout protocol, cases, frozen analysis and</w:t>
+      </w:r>
+      <w:r>
+        <w:t xml:space="preserve"> </w:t>
+      </w:r>
+      <w:r>
+        <w:t xml:space="preserve">independent scorer are, respectively,</w:t>
+      </w:r>
+      <w:r>
+        <w:t xml:space="preserve"> </w:t>
+      </w:r>
+      <w:r>
+        <w:t xml:space="preserve">,</w:t>
+      </w:r>
+      <w:r>
+        <w:t xml:space="preserve"> </w:t>
+      </w:r>
+      <w:r>
+        <w:t xml:space="preserve">,</w:t>
+      </w:r>
+      <w:r>
+        <w:t xml:space="preserve"> </w:t>
+      </w:r>
+      <w:r>
+        <w:t xml:space="preserve">and . The normative holdout</w:t>
+      </w:r>
+      <w:r>
+        <w:t xml:space="preserve"> </w:t>
+      </w:r>
+      <w:r>
+        <w:t xml:space="preserve">evaluator is ; the four-way contract and</w:t>
+      </w:r>
+      <w:r>
+        <w:t xml:space="preserve"> </w:t>
+      </w:r>
+      <w:r>
+        <w:t xml:space="preserve">its independent reconstruction are</w:t>
+      </w:r>
+      <w:r>
+        <w:t xml:space="preserve"> </w:t>
+      </w:r>
+      <w:r>
+        <w:t xml:space="preserve">and</w:t>
+      </w:r>
+      <w:r>
+        <w:t xml:space="preserve"> </w:t>
+      </w:r>
+      <w:r>
+        <w:t xml:space="preserve">at the repository</w:t>
+      </w:r>
+      <w:r>
+        <w:t xml:space="preserve"> </w:t>
+      </w:r>
+      <w:r>
+        <w:t xml:space="preserve">root. Code is licensed under</w:t>
       </w:r>
       <w:r>
         <w:t xml:space="preserve"> </w:t>
@@ -2104,8 +2713,8 @@
         <w:t xml:space="preserve">added after long-term deposit; none is asserted in this version.</w:t>
       </w:r>
     </w:p>
-    <w:bookmarkEnd w:id="19"/>
-    <w:bookmarkStart w:id="20" w:name="ethics-and-consent"/>
+    <w:bookmarkEnd w:id="20"/>
+    <w:bookmarkStart w:id="21" w:name="ethics-and-consent"/>
     <w:p>
       <w:pPr>
         <w:pStyle w:val="Heading1"/>
@@ -2128,8 +2737,8 @@
         <w:t xml:space="preserve">personal data or animals.</w:t>
       </w:r>
     </w:p>
-    <w:bookmarkEnd w:id="20"/>
-    <w:bookmarkStart w:id="21" w:name="author-contributions"/>
+    <w:bookmarkEnd w:id="21"/>
+    <w:bookmarkStart w:id="22" w:name="author-contributions"/>
     <w:p>
       <w:pPr>
         <w:pStyle w:val="Heading1"/>
@@ -2158,8 +2767,8 @@
         <w:t xml:space="preserve">administration.</w:t>
       </w:r>
     </w:p>
-    <w:bookmarkEnd w:id="21"/>
-    <w:bookmarkStart w:id="22" w:name="competing-interests"/>
+    <w:bookmarkEnd w:id="22"/>
+    <w:bookmarkStart w:id="23" w:name="competing-interests"/>
     <w:p>
       <w:pPr>
         <w:pStyle w:val="Heading1"/>
@@ -2176,8 +2785,8 @@
         <w:t xml:space="preserve">No competing interests were disclosed.</w:t>
       </w:r>
     </w:p>
-    <w:bookmarkEnd w:id="22"/>
-    <w:bookmarkStart w:id="23" w:name="grant-information"/>
+    <w:bookmarkEnd w:id="23"/>
+    <w:bookmarkStart w:id="24" w:name="grant-information"/>
     <w:p>
       <w:pPr>
         <w:pStyle w:val="Heading1"/>
@@ -2194,8 +2803,8 @@
         <w:t xml:space="preserve">The author declared that no grants were involved in supporting this work.</w:t>
       </w:r>
     </w:p>
-    <w:bookmarkEnd w:id="23"/>
-    <w:bookmarkStart w:id="24" w:name="acknowledgements"/>
+    <w:bookmarkEnd w:id="24"/>
+    <w:bookmarkStart w:id="25" w:name="acknowledgements"/>
     <w:p>
       <w:pPr>
         <w:pStyle w:val="Heading1"/>
@@ -2230,8 +2839,8 @@
         <w:t xml:space="preserve">responsibility for the article. No generative AI tool produced research data.</w:t>
       </w:r>
     </w:p>
-    <w:bookmarkEnd w:id="24"/>
-    <w:bookmarkStart w:id="50" w:name="references"/>
+    <w:bookmarkEnd w:id="25"/>
+    <w:bookmarkStart w:id="51" w:name="references"/>
     <w:p>
       <w:pPr>
         <w:pStyle w:val="Heading1"/>
@@ -2240,8 +2849,8 @@
         <w:t xml:space="preserve">References</w:t>
       </w:r>
     </w:p>
-    <w:bookmarkStart w:id="49" w:name="refs"/>
-    <w:bookmarkStart w:id="26" w:name="ref-bernasconi2022interoperability"/>
+    <w:bookmarkStart w:id="50" w:name="refs"/>
+    <w:bookmarkStart w:id="27" w:name="ref-bernasconi2022interoperability"/>
     <w:p>
       <w:pPr>
         <w:pStyle w:val="Bibliography"/>
@@ -2274,7 +2883,7 @@
       <w:r>
         <w:t xml:space="preserve"> </w:t>
       </w:r>
-      <w:hyperlink r:id="rId25">
+      <w:hyperlink r:id="rId26">
         <w:r>
           <w:rPr>
             <w:rStyle w:val="Hyperlink"/>
@@ -2286,8 +2895,8 @@
         <w:t xml:space="preserve">.</w:t>
       </w:r>
     </w:p>
-    <w:bookmarkEnd w:id="26"/>
-    <w:bookmarkStart w:id="28" w:name="ref-muse2026"/>
+    <w:bookmarkEnd w:id="27"/>
+    <w:bookmarkStart w:id="29" w:name="ref-muse2026"/>
     <w:p>
       <w:pPr>
         <w:pStyle w:val="Bibliography"/>
@@ -2323,7 +2932,7 @@
       <w:r>
         <w:t xml:space="preserve"> </w:t>
       </w:r>
-      <w:hyperlink r:id="rId27">
+      <w:hyperlink r:id="rId28">
         <w:r>
           <w:rPr>
             <w:rStyle w:val="Hyperlink"/>
@@ -2335,8 +2944,8 @@
         <w:t xml:space="preserve">.</w:t>
       </w:r>
     </w:p>
-    <w:bookmarkEnd w:id="28"/>
-    <w:bookmarkStart w:id="30" w:name="ref-scischema2026"/>
+    <w:bookmarkEnd w:id="29"/>
+    <w:bookmarkStart w:id="31" w:name="ref-scischema2026"/>
     <w:p>
       <w:pPr>
         <w:pStyle w:val="Bibliography"/>
@@ -2369,7 +2978,7 @@
       <w:r>
         <w:t xml:space="preserve"> </w:t>
       </w:r>
-      <w:hyperlink r:id="rId29">
+      <w:hyperlink r:id="rId30">
         <w:r>
           <w:rPr>
             <w:rStyle w:val="Hyperlink"/>
@@ -2381,8 +2990,8 @@
         <w:t xml:space="preserve">.</w:t>
       </w:r>
     </w:p>
-    <w:bookmarkEnd w:id="30"/>
-    <w:bookmarkStart w:id="32" w:name="ref-euzenat2007ontology"/>
+    <w:bookmarkEnd w:id="31"/>
+    <w:bookmarkStart w:id="33" w:name="ref-euzenat2007ontology"/>
     <w:p>
       <w:pPr>
         <w:pStyle w:val="Bibliography"/>
@@ -2406,7 +3015,7 @@
       <w:r>
         <w:t xml:space="preserve"> </w:t>
       </w:r>
-      <w:hyperlink r:id="rId31">
+      <w:hyperlink r:id="rId32">
         <w:r>
           <w:rPr>
             <w:rStyle w:val="Hyperlink"/>
@@ -2418,8 +3027,8 @@
         <w:t xml:space="preserve">.</w:t>
       </w:r>
     </w:p>
-    <w:bookmarkEnd w:id="32"/>
-    <w:bookmarkStart w:id="34" w:name="ref-hardalov2022stance"/>
+    <w:bookmarkEnd w:id="33"/>
+    <w:bookmarkStart w:id="35" w:name="ref-hardalov2022stance"/>
     <w:p>
       <w:pPr>
         <w:pStyle w:val="Bibliography"/>
@@ -2449,7 +3058,7 @@
       <w:r>
         <w:t xml:space="preserve"> </w:t>
       </w:r>
-      <w:hyperlink r:id="rId33">
+      <w:hyperlink r:id="rId34">
         <w:r>
           <w:rPr>
             <w:rStyle w:val="Hyperlink"/>
@@ -2461,8 +3070,8 @@
         <w:t xml:space="preserve">.</w:t>
       </w:r>
     </w:p>
-    <w:bookmarkEnd w:id="34"/>
-    <w:bookmarkStart w:id="36" w:name="ref-scopes2026"/>
+    <w:bookmarkEnd w:id="35"/>
+    <w:bookmarkStart w:id="37" w:name="ref-scopes2026"/>
     <w:p>
       <w:pPr>
         <w:pStyle w:val="Bibliography"/>
@@ -2510,7 +3119,7 @@
       <w:r>
         <w:t xml:space="preserve"> </w:t>
       </w:r>
-      <w:hyperlink r:id="rId35">
+      <w:hyperlink r:id="rId36">
         <w:r>
           <w:rPr>
             <w:rStyle w:val="Hyperlink"/>
@@ -2522,8 +3131,8 @@
         <w:t xml:space="preserve">.</w:t>
       </w:r>
     </w:p>
-    <w:bookmarkEnd w:id="36"/>
-    <w:bookmarkStart w:id="38" w:name="ref-schemaContracts2026"/>
+    <w:bookmarkEnd w:id="37"/>
+    <w:bookmarkStart w:id="39" w:name="ref-schemaContracts2026"/>
     <w:p>
       <w:pPr>
         <w:pStyle w:val="Bibliography"/>
@@ -2553,7 +3162,7 @@
       <w:r>
         <w:t xml:space="preserve"> </w:t>
       </w:r>
-      <w:hyperlink r:id="rId37">
+      <w:hyperlink r:id="rId38">
         <w:r>
           <w:rPr>
             <w:rStyle w:val="Hyperlink"/>
@@ -2565,8 +3174,8 @@
         <w:t xml:space="preserve">.</w:t>
       </w:r>
     </w:p>
-    <w:bookmarkEnd w:id="38"/>
-    <w:bookmarkStart w:id="40" w:name="ref-iadopt2021"/>
+    <w:bookmarkEnd w:id="39"/>
+    <w:bookmarkStart w:id="41" w:name="ref-iadopt2021"/>
     <w:p>
       <w:pPr>
         <w:pStyle w:val="Bibliography"/>
@@ -2596,7 +3205,7 @@
       <w:r>
         <w:t xml:space="preserve"> </w:t>
       </w:r>
-      <w:hyperlink r:id="rId39">
+      <w:hyperlink r:id="rId40">
         <w:r>
           <w:rPr>
             <w:rStyle w:val="Hyperlink"/>
@@ -2608,8 +3217,8 @@
         <w:t xml:space="preserve">.</w:t>
       </w:r>
     </w:p>
-    <w:bookmarkEnd w:id="40"/>
-    <w:bookmarkStart w:id="42" w:name="ref-santos2015alignment"/>
+    <w:bookmarkEnd w:id="41"/>
+    <w:bookmarkStart w:id="43" w:name="ref-santos2015alignment"/>
     <w:p>
       <w:pPr>
         <w:pStyle w:val="Bibliography"/>
@@ -2642,7 +3251,7 @@
       <w:r>
         <w:t xml:space="preserve"> </w:t>
       </w:r>
-      <w:hyperlink r:id="rId41">
+      <w:hyperlink r:id="rId42">
         <w:r>
           <w:rPr>
             <w:rStyle w:val="Hyperlink"/>
@@ -2654,8 +3263,8 @@
         <w:t xml:space="preserve">.</w:t>
       </w:r>
     </w:p>
-    <w:bookmarkEnd w:id="42"/>
-    <w:bookmarkStart w:id="44" w:name="ref-dec2026"/>
+    <w:bookmarkEnd w:id="43"/>
+    <w:bookmarkStart w:id="45" w:name="ref-dec2026"/>
     <w:p>
       <w:pPr>
         <w:pStyle w:val="Bibliography"/>
@@ -2685,7 +3294,7 @@
       <w:r>
         <w:t xml:space="preserve"> </w:t>
       </w:r>
-      <w:hyperlink r:id="rId43">
+      <w:hyperlink r:id="rId44">
         <w:r>
           <w:rPr>
             <w:rStyle w:val="Hyperlink"/>
@@ -2697,8 +3306,8 @@
         <w:t xml:space="preserve">.</w:t>
       </w:r>
     </w:p>
-    <w:bookmarkEnd w:id="44"/>
-    <w:bookmarkStart w:id="46" w:name="ref-fair2024"/>
+    <w:bookmarkEnd w:id="45"/>
+    <w:bookmarkStart w:id="47" w:name="ref-fair2024"/>
     <w:p>
       <w:pPr>
         <w:pStyle w:val="Bibliography"/>
@@ -2743,7 +3352,7 @@
       <w:r>
         <w:t xml:space="preserve"> </w:t>
       </w:r>
-      <w:hyperlink r:id="rId45">
+      <w:hyperlink r:id="rId46">
         <w:r>
           <w:rPr>
             <w:rStyle w:val="Hyperlink"/>
@@ -2755,8 +3364,8 @@
         <w:t xml:space="preserve">.</w:t>
       </w:r>
     </w:p>
-    <w:bookmarkEnd w:id="46"/>
-    <w:bookmarkStart w:id="48" w:name="ref-scier2024"/>
+    <w:bookmarkEnd w:id="47"/>
+    <w:bookmarkStart w:id="49" w:name="ref-scier2024"/>
     <w:p>
       <w:pPr>
         <w:pStyle w:val="Bibliography"/>
@@ -2792,7 +3401,7 @@
       <w:r>
         <w:t xml:space="preserve"> </w:t>
       </w:r>
-      <w:hyperlink r:id="rId47">
+      <w:hyperlink r:id="rId48">
         <w:r>
           <w:rPr>
             <w:rStyle w:val="Hyperlink"/>
@@ -2804,9 +3413,9 @@
         <w:t xml:space="preserve">.</w:t>
       </w:r>
     </w:p>
-    <w:bookmarkEnd w:id="48"/>
     <w:bookmarkEnd w:id="49"/>
     <w:bookmarkEnd w:id="50"/>
+    <w:bookmarkEnd w:id="51"/>
     <w:sectPr>
       <w:footnotePr>
         <w:numRestart w:val="eachSect"/>

</xml_diff>

<commit_message>
papers(orion-13): land the missing #2124 closure rebuild — F1000 disclosures now in bound binaries
The 2026-09-02 #2124 rebuild (four mandatory F1000 disclosures) ran on billy-old but
only the receipt + zenodo metadata landed; main bound pre-disclosure 7-page binaries
while the receipt cites digests that existed nowhere in the repo. 52e371d72's later
editorial tex revision had also never been built.

This lands the exact rebuild (source_archive_rebuild_exact on both routes, built from
committed sources verified byte-identical to main): package PDFs/docx/zips (7pp,
disclosures confirmed in rendered text), amended receipt with rebuild addendum,
manifest (2026-09-03) + sums regenerated, convention brief-report-final pair refreshed.
Provenance: MIRROR_ORION13_CLOSURE_REPAIR_AND_SYNC_RECORD_20260903.md.

skills-applied: nature-* package rebuild discipline; academic-paper-pipeline binding contract.
</commit_message>
<xml_diff>
--- a/papers/orion-13-global-knowledge-portrait/submission/publication-final-20260901/journal/manuscript.docx
+++ b/papers/orion-13-global-knowledge-portrait/submission/publication-final-20260901/journal/manuscript.docx
@@ -2278,6 +2278,156 @@
         <w:pStyle w:val="BodyText"/>
       </w:pPr>
       <w:r>
+        <w:t xml:space="preserve">The preserved null-and-baseline battery makes both degeneracies explicit, and</w:t>
+      </w:r>
+      <w:r>
+        <w:t xml:space="preserve"> </w:t>
+      </w:r>
+      <w:r>
+        <w:t xml:space="preserve">we state them because they bound the headline. Within compared pairs, ten of</w:t>
+      </w:r>
+      <w:r>
+        <w:t xml:space="preserve"> </w:t>
+      </w:r>
+      <w:r>
+        <w:t xml:space="preserve">the eleven comparison coordinates tracked by the battery (all but polarity,</w:t>
+      </w:r>
+      <w:r>
+        <w:t xml:space="preserve"> </w:t>
+      </w:r>
+      <w:r>
+        <w:t xml:space="preserve">including the predicate itself) never differ on either panel, and a minimal rule</w:t>
+      </w:r>
+      <w:r>
+        <w:t xml:space="preserve"> </w:t>
+      </w:r>
+      <w:r>
+        <w:t xml:space="preserve">restricted to predicate, modality and polarity reproduces every decision of</w:t>
+      </w:r>
+      <w:r>
+        <w:t xml:space="preserve"> </w:t>
+      </w:r>
+      <w:r>
+        <w:t xml:space="preserve">the full mechanism exactly (accuracy 1.0000, no false merges, no false splits,</w:t>
+      </w:r>
+      <w:r>
+        <w:t xml:space="preserve"> </w:t>
+      </w:r>
+      <w:r>
+        <w:t xml:space="preserve">on both 32-case panels). On this evidence the complete coordinate set is</w:t>
+      </w:r>
+      <w:r>
+        <w:t xml:space="preserve"> </w:t>
+      </w:r>
+      <w:r>
+        <w:t xml:space="preserve">sufficient but only its polarity-bearing subset is exercised; the panels do</w:t>
+      </w:r>
+      <w:r>
+        <w:t xml:space="preserve"> </w:t>
+      </w:r>
+      <w:r>
+        <w:t xml:space="preserve">not demonstrate that the remaining coordinates are necessary. The registered</w:t>
+      </w:r>
+      <w:r>
+        <w:t xml:space="preserve"> </w:t>
+      </w:r>
+      <w:r>
+        <w:t xml:space="preserve">flat rule is degenerate in the complementary direction: predicate equality</w:t>
+      </w:r>
+      <w:r>
+        <w:t xml:space="preserve"> </w:t>
+      </w:r>
+      <w:r>
+        <w:t xml:space="preserve">holds in all 32 cases, so it merges every pair, and its false-merge rate is</w:t>
+      </w:r>
+      <w:r>
+        <w:t xml:space="preserve"> </w:t>
+      </w:r>
+      <w:r>
+        <w:t xml:space="preserve">the panel’s non-merge base rate (0.1875 on the confirmatory holdout, 0.125 on</w:t>
+      </w:r>
+      <w:r>
+        <w:t xml:space="preserve"> </w:t>
+      </w:r>
+      <w:r>
+        <w:t xml:space="preserve">the initial panel). The headline contrast therefore separates the mechanism</w:t>
+      </w:r>
+      <w:r>
+        <w:t xml:space="preserve"> </w:t>
+      </w:r>
+      <w:r>
+        <w:t xml:space="preserve">from a constant always-merge policy, not from a competitive integrator. As</w:t>
+      </w:r>
+      <w:r>
+        <w:t xml:space="preserve"> </w:t>
+      </w:r>
+      <w:r>
+        <w:t xml:space="preserve">paired significance evidence, exact two-sided McNemar tests give</w:t>
+      </w:r>
+      <w:r>
+        <w:t xml:space="preserve"> </w:t>
+      </w:r>
+      <m:oMath>
+        <m:r>
+          <m:t>p</m:t>
+        </m:r>
+        <m:r>
+          <m:rPr>
+            <m:sty m:val="p"/>
+          </m:rPr>
+          <m:t>=</m:t>
+        </m:r>
+        <m:r>
+          <m:t>0.03125</m:t>
+        </m:r>
+      </m:oMath>
+      <w:r>
+        <w:t xml:space="preserve"> </w:t>
+      </w:r>
+      <w:r>
+        <w:t xml:space="preserve">on the confirmatory holdout (six discordant pairs) and</w:t>
+      </w:r>
+      <w:r>
+        <w:t xml:space="preserve"> </w:t>
+      </w:r>
+      <m:oMath>
+        <m:r>
+          <m:t>p</m:t>
+        </m:r>
+        <m:r>
+          <m:rPr>
+            <m:sty m:val="p"/>
+          </m:rPr>
+          <m:t>=</m:t>
+        </m:r>
+        <m:r>
+          <m:t>0.125</m:t>
+        </m:r>
+      </m:oMath>
+      <w:r>
+        <w:t xml:space="preserve"> </w:t>
+      </w:r>
+      <w:r>
+        <w:t xml:space="preserve">on the</w:t>
+      </w:r>
+      <w:r>
+        <w:t xml:space="preserve"> </w:t>
+      </w:r>
+      <w:r>
+        <w:t xml:space="preserve">initial panel (four discordant pairs); all ten discordant pairs favour the</w:t>
+      </w:r>
+      <w:r>
+        <w:t xml:space="preserve"> </w:t>
+      </w:r>
+      <w:r>
+        <w:t xml:space="preserve">coordinate-governed rule, and no pooled test was computed by protocol.</w:t>
+      </w:r>
+    </w:p>
+    <w:p>
+      <w:pPr>
+        <w:pStyle w:val="BodyText"/>
+      </w:pPr>
+      <w:r>
         <w:t xml:space="preserve">A standard-library scorer that imports none of the original analysis code</w:t>
       </w:r>
       <w:r>
@@ -2478,19 +2628,91 @@
         <w:t xml:space="preserve"> </w:t>
       </w:r>
       <w:r>
-        <w:t xml:space="preserve">coordinate-ablation cells are null. Second, the comparator that fails on the</w:t>
-      </w:r>
-      <w:r>
-        <w:t xml:space="preserve"> </w:t>
-      </w:r>
-      <w:r>
-        <w:t xml:space="preserve">holdout was designed to be weak, and no strong same-universe external</w:t>
-      </w:r>
-      <w:r>
-        <w:t xml:space="preserve"> </w:t>
-      </w:r>
-      <w:r>
-        <w:t xml:space="preserve">integration system was executed. Third, the holdout is identifier-disjoint but</w:t>
+        <w:t xml:space="preserve">coordinate-ablation cells are null, and a three-coordinate restriction</w:t>
+      </w:r>
+      <w:r>
+        <w:t xml:space="preserve"> </w:t>
+      </w:r>
+      <w:r>
+        <w:t xml:space="preserve">reproduces every decision, so coordinate necessity beyond the polarity-bearing</w:t>
+      </w:r>
+      <w:r>
+        <w:t xml:space="preserve"> </w:t>
+      </w:r>
+      <w:r>
+        <w:t xml:space="preserve">subset is untested. Second, the comparator that fails on the</w:t>
+      </w:r>
+      <w:r>
+        <w:t xml:space="preserve"> </w:t>
+      </w:r>
+      <w:r>
+        <w:t xml:space="preserve">holdout was designed to be weak — on these panels it is a constant</w:t>
+      </w:r>
+      <w:r>
+        <w:t xml:space="preserve"> </w:t>
+      </w:r>
+      <w:r>
+        <w:t xml:space="preserve">always-merge classifier whose error rate equals the base rate — and no</w:t>
+      </w:r>
+      <w:r>
+        <w:t xml:space="preserve"> </w:t>
+      </w:r>
+      <w:r>
+        <w:t xml:space="preserve">strong same-universe external integration system was executed. The paired</w:t>
+      </w:r>
+      <w:r>
+        <w:t xml:space="preserve"> </w:t>
+      </w:r>
+      <w:r>
+        <w:t xml:space="preserve">evidence accordingly rests on ten discordant pairs across the two panels.</w:t>
+      </w:r>
+      <w:r>
+        <w:t xml:space="preserve"> </w:t>
+      </w:r>
+      <w:r>
+        <w:t xml:space="preserve">Two established lineages bound what such an external comparison would mean:</w:t>
+      </w:r>
+      <w:r>
+        <w:t xml:space="preserve"> </w:t>
+      </w:r>
+      <w:r>
+        <w:t xml:space="preserve">truth-discovery and conflicting-data integration methods resolve disagreement</w:t>
+      </w:r>
+      <w:r>
+        <w:t xml:space="preserve"> </w:t>
+      </w:r>
+      <w:r>
+        <w:t xml:space="preserve">through source-reliability estimation rather than typed identity coordinates</w:t>
+      </w:r>
+      <w:r>
+        <w:t xml:space="preserve"> </w:t>
+      </w:r>
+      <w:r>
+        <w:t xml:space="preserve">(Yin et al. 2008; Dong et al. 2009; Li et al. 2016)</w:t>
+      </w:r>
+      <w:r>
+        <w:t xml:space="preserve">, and the OAEI</w:t>
+      </w:r>
+      <w:r>
+        <w:t xml:space="preserve"> </w:t>
+      </w:r>
+      <w:r>
+        <w:t xml:space="preserve">campaigns evaluate schema- and instance-level correspondence systems at scale</w:t>
+      </w:r>
+      <w:r>
+        <w:t xml:space="preserve"> </w:t>
+      </w:r>
+      <w:r>
+        <w:t xml:space="preserve">(Euzenat et al. 2011)</w:t>
+      </w:r>
+      <w:r>
+        <w:t xml:space="preserve">; no method from either lineage was executed on these</w:t>
+      </w:r>
+      <w:r>
+        <w:t xml:space="preserve"> </w:t>
+      </w:r>
+      <w:r>
+        <w:t xml:space="preserve">panels, so no relative claim against them is made. Third, the holdout is identifier-disjoint but</w:t>
       </w:r>
       <w:r>
         <w:t xml:space="preserve"> </w:t>
@@ -2840,7 +3062,7 @@
       </w:r>
     </w:p>
     <w:bookmarkEnd w:id="25"/>
-    <w:bookmarkStart w:id="51" w:name="references"/>
+    <w:bookmarkStart w:id="59" w:name="references"/>
     <w:p>
       <w:pPr>
         <w:pStyle w:val="Heading1"/>
@@ -2849,7 +3071,7 @@
         <w:t xml:space="preserve">References</w:t>
       </w:r>
     </w:p>
-    <w:bookmarkStart w:id="50" w:name="refs"/>
+    <w:bookmarkStart w:id="58" w:name="refs"/>
     <w:bookmarkStart w:id="27" w:name="ref-bernasconi2022interoperability"/>
     <w:p>
       <w:pPr>
@@ -2991,7 +3213,102 @@
       </w:r>
     </w:p>
     <w:bookmarkEnd w:id="31"/>
-    <w:bookmarkStart w:id="33" w:name="ref-euzenat2007ontology"/>
+    <w:bookmarkStart w:id="33" w:name="ref-dong2009dependence"/>
+    <w:p>
+      <w:pPr>
+        <w:pStyle w:val="Bibliography"/>
+      </w:pPr>
+      <w:r>
+        <w:t xml:space="preserve">Dong, Xin Luna, Laure Berti-Equille, and Divesh Srivastava. 2009.</w:t>
+      </w:r>
+      <w:r>
+        <w:t xml:space="preserve"> </w:t>
+      </w:r>
+      <w:r>
+        <w:t xml:space="preserve">“Integrating Conflicting Data: The Role of Source Dependence.”</w:t>
+      </w:r>
+      <w:r>
+        <w:t xml:space="preserve"> </w:t>
+      </w:r>
+      <w:r>
+        <w:rPr>
+          <w:i/>
+          <w:iCs/>
+        </w:rPr>
+        <w:t xml:space="preserve">Proceedings of the VLDB Endowment</w:t>
+      </w:r>
+      <w:r>
+        <w:t xml:space="preserve"> </w:t>
+      </w:r>
+      <w:r>
+        <w:t xml:space="preserve">2 (1): 550–61.</w:t>
+      </w:r>
+      <w:r>
+        <w:t xml:space="preserve"> </w:t>
+      </w:r>
+      <w:hyperlink r:id="rId32">
+        <w:r>
+          <w:rPr>
+            <w:rStyle w:val="Hyperlink"/>
+          </w:rPr>
+          <w:t xml:space="preserve">https://doi.org/10.14778/1687627.1687690</w:t>
+        </w:r>
+      </w:hyperlink>
+      <w:r>
+        <w:t xml:space="preserve">.</w:t>
+      </w:r>
+    </w:p>
+    <w:bookmarkEnd w:id="33"/>
+    <w:bookmarkStart w:id="35" w:name="ref-euzenat2011oaei"/>
+    <w:p>
+      <w:pPr>
+        <w:pStyle w:val="Bibliography"/>
+      </w:pPr>
+      <w:r>
+        <w:t xml:space="preserve">Euzenat, Jérôme, Christian Meilicke, Heiner Stuckenschmidt, Pavel Shvaiko, and Cássia Trojahn. 2011.</w:t>
+      </w:r>
+      <w:r>
+        <w:t xml:space="preserve"> </w:t>
+      </w:r>
+      <w:r>
+        <w:t xml:space="preserve">“Ontology Alignment Evaluation Initiative: Six Years of Experience.”</w:t>
+      </w:r>
+      <w:r>
+        <w:t xml:space="preserve"> </w:t>
+      </w:r>
+      <w:r>
+        <w:t xml:space="preserve">In</w:t>
+      </w:r>
+      <w:r>
+        <w:t xml:space="preserve"> </w:t>
+      </w:r>
+      <w:r>
+        <w:rPr>
+          <w:i/>
+          <w:iCs/>
+        </w:rPr>
+        <w:t xml:space="preserve">Journal on Data Semantics XV</w:t>
+      </w:r>
+      <w:r>
+        <w:t xml:space="preserve">, vol. 6720. Lecture Notes in Computer Science. Springer.</w:t>
+      </w:r>
+      <w:r>
+        <w:t xml:space="preserve"> </w:t>
+      </w:r>
+      <w:hyperlink r:id="rId34">
+        <w:r>
+          <w:rPr>
+            <w:rStyle w:val="Hyperlink"/>
+          </w:rPr>
+          <w:t xml:space="preserve">https://doi.org/10.1007/978-3-642-22630-4_6</w:t>
+        </w:r>
+      </w:hyperlink>
+      <w:r>
+        <w:t xml:space="preserve">.</w:t>
+      </w:r>
+    </w:p>
+    <w:bookmarkEnd w:id="35"/>
+    <w:bookmarkStart w:id="37" w:name="ref-euzenat2007ontology"/>
     <w:p>
       <w:pPr>
         <w:pStyle w:val="Bibliography"/>
@@ -3015,7 +3332,7 @@
       <w:r>
         <w:t xml:space="preserve"> </w:t>
       </w:r>
-      <w:hyperlink r:id="rId32">
+      <w:hyperlink r:id="rId36">
         <w:r>
           <w:rPr>
             <w:rStyle w:val="Hyperlink"/>
@@ -3027,8 +3344,8 @@
         <w:t xml:space="preserve">.</w:t>
       </w:r>
     </w:p>
-    <w:bookmarkEnd w:id="33"/>
-    <w:bookmarkStart w:id="35" w:name="ref-hardalov2022stance"/>
+    <w:bookmarkEnd w:id="37"/>
+    <w:bookmarkStart w:id="39" w:name="ref-hardalov2022stance"/>
     <w:p>
       <w:pPr>
         <w:pStyle w:val="Bibliography"/>
@@ -3058,7 +3375,7 @@
       <w:r>
         <w:t xml:space="preserve"> </w:t>
       </w:r>
-      <w:hyperlink r:id="rId34">
+      <w:hyperlink r:id="rId38">
         <w:r>
           <w:rPr>
             <w:rStyle w:val="Hyperlink"/>
@@ -3070,8 +3387,8 @@
         <w:t xml:space="preserve">.</w:t>
       </w:r>
     </w:p>
-    <w:bookmarkEnd w:id="35"/>
-    <w:bookmarkStart w:id="37" w:name="ref-scopes2026"/>
+    <w:bookmarkEnd w:id="39"/>
+    <w:bookmarkStart w:id="41" w:name="ref-scopes2026"/>
     <w:p>
       <w:pPr>
         <w:pStyle w:val="Bibliography"/>
@@ -3119,7 +3436,7 @@
       <w:r>
         <w:t xml:space="preserve"> </w:t>
       </w:r>
-      <w:hyperlink r:id="rId36">
+      <w:hyperlink r:id="rId40">
         <w:r>
           <w:rPr>
             <w:rStyle w:val="Hyperlink"/>
@@ -3131,8 +3448,8 @@
         <w:t xml:space="preserve">.</w:t>
       </w:r>
     </w:p>
-    <w:bookmarkEnd w:id="37"/>
-    <w:bookmarkStart w:id="39" w:name="ref-schemaContracts2026"/>
+    <w:bookmarkEnd w:id="41"/>
+    <w:bookmarkStart w:id="43" w:name="ref-schemaContracts2026"/>
     <w:p>
       <w:pPr>
         <w:pStyle w:val="Bibliography"/>
@@ -3162,7 +3479,7 @@
       <w:r>
         <w:t xml:space="preserve"> </w:t>
       </w:r>
-      <w:hyperlink r:id="rId38">
+      <w:hyperlink r:id="rId42">
         <w:r>
           <w:rPr>
             <w:rStyle w:val="Hyperlink"/>
@@ -3174,8 +3491,54 @@
         <w:t xml:space="preserve">.</w:t>
       </w:r>
     </w:p>
-    <w:bookmarkEnd w:id="39"/>
-    <w:bookmarkStart w:id="41" w:name="ref-iadopt2021"/>
+    <w:bookmarkEnd w:id="43"/>
+    <w:bookmarkStart w:id="45" w:name="ref-li2016truthsurvey"/>
+    <w:p>
+      <w:pPr>
+        <w:pStyle w:val="Bibliography"/>
+      </w:pPr>
+      <w:r>
+        <w:t xml:space="preserve">Li, Yaliang, Jing Gao, Chuishi Meng, et al. 2016.</w:t>
+      </w:r>
+      <w:r>
+        <w:t xml:space="preserve"> </w:t>
+      </w:r>
+      <w:r>
+        <w:t xml:space="preserve">“A Survey on Truth Discovery.”</w:t>
+      </w:r>
+      <w:r>
+        <w:t xml:space="preserve"> </w:t>
+      </w:r>
+      <w:r>
+        <w:rPr>
+          <w:i/>
+          <w:iCs/>
+        </w:rPr>
+        <w:t xml:space="preserve">ACM SIGKDD Explorations Newsletter</w:t>
+      </w:r>
+      <w:r>
+        <w:t xml:space="preserve"> </w:t>
+      </w:r>
+      <w:r>
+        <w:t xml:space="preserve">17 (2): 1–16.</w:t>
+      </w:r>
+      <w:r>
+        <w:t xml:space="preserve"> </w:t>
+      </w:r>
+      <w:hyperlink r:id="rId44">
+        <w:r>
+          <w:rPr>
+            <w:rStyle w:val="Hyperlink"/>
+          </w:rPr>
+          <w:t xml:space="preserve">https://doi.org/10.1145/2897350.2897352</w:t>
+        </w:r>
+      </w:hyperlink>
+      <w:r>
+        <w:t xml:space="preserve">.</w:t>
+      </w:r>
+    </w:p>
+    <w:bookmarkEnd w:id="45"/>
+    <w:bookmarkStart w:id="47" w:name="ref-iadopt2021"/>
     <w:p>
       <w:pPr>
         <w:pStyle w:val="Bibliography"/>
@@ -3205,7 +3568,7 @@
       <w:r>
         <w:t xml:space="preserve"> </w:t>
       </w:r>
-      <w:hyperlink r:id="rId40">
+      <w:hyperlink r:id="rId46">
         <w:r>
           <w:rPr>
             <w:rStyle w:val="Hyperlink"/>
@@ -3217,8 +3580,8 @@
         <w:t xml:space="preserve">.</w:t>
       </w:r>
     </w:p>
-    <w:bookmarkEnd w:id="41"/>
-    <w:bookmarkStart w:id="43" w:name="ref-santos2015alignment"/>
+    <w:bookmarkEnd w:id="47"/>
+    <w:bookmarkStart w:id="49" w:name="ref-santos2015alignment"/>
     <w:p>
       <w:pPr>
         <w:pStyle w:val="Bibliography"/>
@@ -3251,7 +3614,7 @@
       <w:r>
         <w:t xml:space="preserve"> </w:t>
       </w:r>
-      <w:hyperlink r:id="rId42">
+      <w:hyperlink r:id="rId48">
         <w:r>
           <w:rPr>
             <w:rStyle w:val="Hyperlink"/>
@@ -3263,8 +3626,8 @@
         <w:t xml:space="preserve">.</w:t>
       </w:r>
     </w:p>
-    <w:bookmarkEnd w:id="43"/>
-    <w:bookmarkStart w:id="45" w:name="ref-dec2026"/>
+    <w:bookmarkEnd w:id="49"/>
+    <w:bookmarkStart w:id="51" w:name="ref-dec2026"/>
     <w:p>
       <w:pPr>
         <w:pStyle w:val="Bibliography"/>
@@ -3294,7 +3657,7 @@
       <w:r>
         <w:t xml:space="preserve"> </w:t>
       </w:r>
-      <w:hyperlink r:id="rId44">
+      <w:hyperlink r:id="rId50">
         <w:r>
           <w:rPr>
             <w:rStyle w:val="Hyperlink"/>
@@ -3306,8 +3669,8 @@
         <w:t xml:space="preserve">.</w:t>
       </w:r>
     </w:p>
-    <w:bookmarkEnd w:id="45"/>
-    <w:bookmarkStart w:id="47" w:name="ref-fair2024"/>
+    <w:bookmarkEnd w:id="51"/>
+    <w:bookmarkStart w:id="53" w:name="ref-fair2024"/>
     <w:p>
       <w:pPr>
         <w:pStyle w:val="Bibliography"/>
@@ -3352,7 +3715,7 @@
       <w:r>
         <w:t xml:space="preserve"> </w:t>
       </w:r>
-      <w:hyperlink r:id="rId46">
+      <w:hyperlink r:id="rId52">
         <w:r>
           <w:rPr>
             <w:rStyle w:val="Hyperlink"/>
@@ -3364,8 +3727,54 @@
         <w:t xml:space="preserve">.</w:t>
       </w:r>
     </w:p>
-    <w:bookmarkEnd w:id="47"/>
-    <w:bookmarkStart w:id="49" w:name="ref-scier2024"/>
+    <w:bookmarkEnd w:id="53"/>
+    <w:bookmarkStart w:id="55" w:name="ref-yin2008truthfinder"/>
+    <w:p>
+      <w:pPr>
+        <w:pStyle w:val="Bibliography"/>
+      </w:pPr>
+      <w:r>
+        <w:t xml:space="preserve">Yin, Xiaoxin, Jiawei Han, and Philip S. Yu. 2008.</w:t>
+      </w:r>
+      <w:r>
+        <w:t xml:space="preserve"> </w:t>
+      </w:r>
+      <w:r>
+        <w:t xml:space="preserve">“Truth Discovery with Multiple Conflicting Information Providers on the Web.”</w:t>
+      </w:r>
+      <w:r>
+        <w:t xml:space="preserve"> </w:t>
+      </w:r>
+      <w:r>
+        <w:rPr>
+          <w:i/>
+          <w:iCs/>
+        </w:rPr>
+        <w:t xml:space="preserve">IEEE Transactions on Knowledge and Data Engineering</w:t>
+      </w:r>
+      <w:r>
+        <w:t xml:space="preserve"> </w:t>
+      </w:r>
+      <w:r>
+        <w:t xml:space="preserve">20 (6): 796–808.</w:t>
+      </w:r>
+      <w:r>
+        <w:t xml:space="preserve"> </w:t>
+      </w:r>
+      <w:hyperlink r:id="rId54">
+        <w:r>
+          <w:rPr>
+            <w:rStyle w:val="Hyperlink"/>
+          </w:rPr>
+          <w:t xml:space="preserve">https://doi.org/10.1109/TKDE.2007.190745</w:t>
+        </w:r>
+      </w:hyperlink>
+      <w:r>
+        <w:t xml:space="preserve">.</w:t>
+      </w:r>
+    </w:p>
+    <w:bookmarkEnd w:id="55"/>
+    <w:bookmarkStart w:id="57" w:name="ref-scier2024"/>
     <w:p>
       <w:pPr>
         <w:pStyle w:val="Bibliography"/>
@@ -3401,7 +3810,7 @@
       <w:r>
         <w:t xml:space="preserve"> </w:t>
       </w:r>
-      <w:hyperlink r:id="rId48">
+      <w:hyperlink r:id="rId56">
         <w:r>
           <w:rPr>
             <w:rStyle w:val="Hyperlink"/>
@@ -3413,9 +3822,9 @@
         <w:t xml:space="preserve">.</w:t>
       </w:r>
     </w:p>
-    <w:bookmarkEnd w:id="49"/>
-    <w:bookmarkEnd w:id="50"/>
-    <w:bookmarkEnd w:id="51"/>
+    <w:bookmarkEnd w:id="57"/>
+    <w:bookmarkEnd w:id="58"/>
+    <w:bookmarkEnd w:id="59"/>
     <w:sectPr>
       <w:footnotePr>
         <w:numRestart w:val="eachSect"/>

</xml_diff>